<commit_message>
Sync experience section with latest resume
Update the Experience timeline copy to match the resume verbatim.

Also replace the downloadable resume .docx and .pdf with the latest
versions.
</commit_message>
<xml_diff>
--- a/public/ThomasReid_Resume_2026.docx
+++ b/public/ThomasReid_Resume_2026.docx
@@ -44,7 +44,7 @@
           <w:rFonts w:ascii="Calibri" w:cs="Calibri" w:eastAsia="Calibri" w:hAnsi="Calibri"/>
           <w:rtl w:val="0"/>
         </w:rPr>
-        <w:t xml:space="preserve">treid1409</w:t>
+        <w:t xml:space="preserve">New Jersey | treid1409</w:t>
       </w:r>
       <w:hyperlink r:id="rId6">
         <w:r>
@@ -60,7 +60,25 @@
           <w:rFonts w:ascii="Calibri" w:cs="Calibri" w:eastAsia="Calibri" w:hAnsi="Calibri"/>
           <w:rtl w:val="0"/>
         </w:rPr>
-        <w:t xml:space="preserve"> | New Jersey - NYC Metro Area</w:t>
+        <w:t xml:space="preserve"> | </w:t>
+      </w:r>
+      <w:hyperlink r:id="rId7">
+        <w:r>
+          <w:rPr>
+            <w:rFonts w:ascii="Calibri" w:cs="Calibri" w:eastAsia="Calibri" w:hAnsi="Calibri"/>
+            <w:color w:val="1155cc"/>
+            <w:u w:val="single"/>
+            <w:rtl w:val="0"/>
+          </w:rPr>
+          <w:t xml:space="preserve">https://treid99.github.io/portfolio/</w:t>
+        </w:r>
+      </w:hyperlink>
+      <w:r>
+        <w:rPr>
+          <w:rFonts w:ascii="Calibri" w:cs="Calibri" w:eastAsia="Calibri" w:hAnsi="Calibri"/>
+          <w:rtl w:val="0"/>
+        </w:rPr>
+        <w:t xml:space="preserve"> </w:t>
       </w:r>
       <w:r>
         <w:rPr>
@@ -144,7 +162,7 @@
           <w:rFonts w:ascii="Calibri" w:cs="Calibri" w:eastAsia="Calibri" w:hAnsi="Calibri"/>
           <w:rtl w:val="0"/>
         </w:rPr>
-        <w:t xml:space="preserve"> TypeScript, JavaScript, Python, Java, HTML/CSS</w:t>
+        <w:t xml:space="preserve"> TypeScript, JavaScript, Java, Python, HTML/CSS</w:t>
       </w:r>
     </w:p>
     <w:p>
@@ -169,7 +187,7 @@
           <w:rFonts w:ascii="Calibri" w:cs="Calibri" w:eastAsia="Calibri" w:hAnsi="Calibri"/>
           <w:rtl w:val="0"/>
         </w:rPr>
-        <w:t xml:space="preserve">: VSCode, AWS CodeCommit, GitHub, Snowflake, Redis, Grafana, Postman, Claude, Cursor</w:t>
+        <w:t xml:space="preserve">: VSCode, AWS CodeCommit, GitHub, Snowflake, Grafana, Postman, ClaudeCode</w:t>
       </w:r>
     </w:p>
     <w:p>
@@ -194,32 +212,32 @@
           <w:rFonts w:ascii="Calibri" w:cs="Calibri" w:eastAsia="Calibri" w:hAnsi="Calibri"/>
           <w:rtl w:val="0"/>
         </w:rPr>
-        <w:t xml:space="preserve">Playwright, Cypress, Mocha, Chai, Testim</w:t>
-      </w:r>
-    </w:p>
-    <w:p>
-      <w:pPr>
-        <w:widowControl w:val="0"/>
-        <w:spacing w:line="256.8" w:lineRule="auto"/>
-        <w:rPr>
-          <w:rFonts w:ascii="Calibri" w:cs="Calibri" w:eastAsia="Calibri" w:hAnsi="Calibri"/>
-        </w:rPr>
-      </w:pPr>
-      <w:r>
-        <w:rPr>
-          <w:rFonts w:ascii="Calibri" w:cs="Calibri" w:eastAsia="Calibri" w:hAnsi="Calibri"/>
-          <w:b w:val="1"/>
-          <w:bCs w:val="1"/>
-          <w:rtl w:val="0"/>
-        </w:rPr>
-        <w:t xml:space="preserve">Applications:</w:t>
-      </w:r>
-      <w:r>
-        <w:rPr>
-          <w:rFonts w:ascii="Calibri" w:cs="Calibri" w:eastAsia="Calibri" w:hAnsi="Calibri"/>
-          <w:rtl w:val="0"/>
-        </w:rPr>
-        <w:t xml:space="preserve"> Jira, Confluence, Linear, TestRail, Excel</w:t>
+        <w:t xml:space="preserve">Playwright, Cypress, Mocha</w:t>
+      </w:r>
+    </w:p>
+    <w:p>
+      <w:pPr>
+        <w:widowControl w:val="0"/>
+        <w:spacing w:line="256.8" w:lineRule="auto"/>
+        <w:rPr>
+          <w:rFonts w:ascii="Calibri" w:cs="Calibri" w:eastAsia="Calibri" w:hAnsi="Calibri"/>
+        </w:rPr>
+      </w:pPr>
+      <w:r>
+        <w:rPr>
+          <w:rFonts w:ascii="Calibri" w:cs="Calibri" w:eastAsia="Calibri" w:hAnsi="Calibri"/>
+          <w:b w:val="1"/>
+          <w:bCs w:val="1"/>
+          <w:rtl w:val="0"/>
+        </w:rPr>
+        <w:t xml:space="preserve">Workflow Apps:</w:t>
+      </w:r>
+      <w:r>
+        <w:rPr>
+          <w:rFonts w:ascii="Calibri" w:cs="Calibri" w:eastAsia="Calibri" w:hAnsi="Calibri"/>
+          <w:rtl w:val="0"/>
+        </w:rPr>
+        <w:t xml:space="preserve"> Linear, Jira, Confluence, TestRail, Excel</w:t>
         <w:br w:type="textWrapping"/>
       </w:r>
       <w:r>
@@ -325,7 +343,7 @@
           <w:bCs w:val="1"/>
           <w:rtl w:val="0"/>
         </w:rPr>
-        <w:t xml:space="preserve">Software Development Engineer in Test (SDET),</w:t>
+        <w:t xml:space="preserve">Test Engineer (IC2),</w:t>
       </w:r>
       <w:r>
         <w:rPr>
@@ -355,7 +373,7 @@
           <w:rFonts w:ascii="Calibri" w:cs="Calibri" w:eastAsia="Calibri" w:hAnsi="Calibri"/>
           <w:rtl w:val="0"/>
         </w:rPr>
-        <w:t xml:space="preserve">Expanded the QA workflow into an automation-focused testing strategy by leveraging AI tooling to accelerate test creation, maintenance, and release validation across the rapidly evolving development ecosystem.</w:t>
+        <w:t xml:space="preserve">Transformed the QA workflow into an automation-focused testing strategy by leveraging AI tooling to accelerate test creation, maintenance, and release validation across the rapidly evolving development ecosystem.</w:t>
       </w:r>
     </w:p>
     <w:p>
@@ -376,7 +394,7 @@
           <w:rFonts w:ascii="Calibri" w:cs="Calibri" w:eastAsia="Calibri" w:hAnsi="Calibri"/>
           <w:rtl w:val="0"/>
         </w:rPr>
-        <w:t xml:space="preserve">Built and maintained end-to-end Playwright tests, expanding test coverage by over 10x in 6 months while supporting increased engineering output.</w:t>
+        <w:t xml:space="preserve">Built, maintained, and executed end-to-end tests in Playwright, vastly expanding automated test coverage while supporting increased engineering output.</w:t>
       </w:r>
     </w:p>
     <w:p>
@@ -403,6 +421,28 @@
     <w:p>
       <w:pPr>
         <w:widowControl w:val="0"/>
+        <w:numPr>
+          <w:ilvl w:val="0"/>
+          <w:numId w:val="1"/>
+        </w:numPr>
+        <w:spacing w:line="256.8" w:lineRule="auto"/>
+        <w:ind w:left="720" w:hanging="360"/>
+        <w:rPr>
+          <w:rFonts w:ascii="Calibri" w:cs="Calibri" w:eastAsia="Calibri" w:hAnsi="Calibri"/>
+          <w:u w:val="none"/>
+        </w:rPr>
+      </w:pPr>
+      <w:r>
+        <w:rPr>
+          <w:rFonts w:ascii="Calibri" w:cs="Calibri" w:eastAsia="Calibri" w:hAnsi="Calibri"/>
+          <w:rtl w:val="0"/>
+        </w:rPr>
+        <w:t xml:space="preserve">Accelerated and improved bug investigations and root-cause analysis by precisely identifying defects within source code and delivering detailed, actionable reports. </w:t>
+      </w:r>
+    </w:p>
+    <w:p>
+      <w:pPr>
+        <w:widowControl w:val="0"/>
         <w:spacing w:line="256.8" w:lineRule="auto"/>
         <w:ind w:left="720" w:firstLine="0"/>
         <w:rPr>
@@ -495,7 +535,7 @@
           <w:rFonts w:ascii="Calibri" w:cs="Calibri" w:eastAsia="Calibri" w:hAnsi="Calibri"/>
           <w:rtl w:val="0"/>
         </w:rPr>
-        <w:t xml:space="preserve">Performed manual QA testing across the full suite of ClassLink Analytics products, including feature validation, regression testing, and post-release smoke testing covering all front-end and back-end systems. </w:t>
+        <w:t xml:space="preserve">Performed manual QA testing across the full suite of ClassLink Analytics products, including feature validation, regression testing, and post-release sanity testing covering all front-end and back-end systems. </w:t>
       </w:r>
     </w:p>
     <w:p>
@@ -558,7 +598,7 @@
           <w:rFonts w:ascii="Calibri" w:cs="Calibri" w:eastAsia="Calibri" w:hAnsi="Calibri"/>
           <w:rtl w:val="0"/>
         </w:rPr>
-        <w:t xml:space="preserve">Supported a long-term full stack overhaul including a UI redesign,  database migration, and several new product launches while ensuring a consistently high-quality user experience and accuracy of millions of daily data points.   </w:t>
+        <w:t xml:space="preserve">Supported a long-term full stack overhaul including a UI redesign,  database migration, and several new product launches while ensuring a consistently high-quality user experience and data accuracy.   </w:t>
       </w:r>
     </w:p>
     <w:p>
@@ -658,7 +698,7 @@
           <w:rFonts w:ascii="Calibri" w:cs="Calibri" w:eastAsia="Calibri" w:hAnsi="Calibri"/>
           <w:rtl w:val="0"/>
         </w:rPr>
-        <w:t xml:space="preserve">Provided Tier 2 technical support to school districts and IT administrators for issues related to rostering, account provisioning, authentication, analytics, admin configuration, and data import/export workflows.</w:t>
+        <w:t xml:space="preserve">Provided Tier 2 technical support to school districts and IT administrators for issues related to rostering, account provisioning, authentication, analytics, admin configuration, and data imports/exports.</w:t>
       </w:r>
     </w:p>
     <w:p>
@@ -679,7 +719,7 @@
           <w:rFonts w:ascii="Calibri" w:cs="Calibri" w:eastAsia="Calibri" w:hAnsi="Calibri"/>
           <w:rtl w:val="0"/>
         </w:rPr>
-        <w:t xml:space="preserve">Configured and troubleshot SSO integrations connecting to external education platforms including Canvas and Schoology using SAML, LTI, and OAuth2 protocols, and custom automation scripts.</w:t>
+        <w:t xml:space="preserve">Configured and troubleshot SSO integrations connecting to external ed-tech vendors using SAML, LTI, and OAuth2 protocols, and custom automated scripts for seamless access.</w:t>
       </w:r>
     </w:p>
     <w:p>
@@ -700,28 +740,7 @@
           <w:rFonts w:ascii="Calibri" w:cs="Calibri" w:eastAsia="Calibri" w:hAnsi="Calibri"/>
           <w:rtl w:val="0"/>
         </w:rPr>
-        <w:t xml:space="preserve">Resolved complex technical issues alongside onboarding, product, and engineering teams while leading client-facing troubleshooting sessions with district administrators and third-party vendors.</w:t>
-      </w:r>
-    </w:p>
-    <w:p>
-      <w:pPr>
-        <w:widowControl w:val="0"/>
-        <w:numPr>
-          <w:ilvl w:val="0"/>
-          <w:numId w:val="1"/>
-        </w:numPr>
-        <w:spacing w:line="256.8" w:lineRule="auto"/>
-        <w:ind w:left="720" w:hanging="360"/>
-        <w:rPr>
-          <w:rFonts w:ascii="Calibri" w:cs="Calibri" w:eastAsia="Calibri" w:hAnsi="Calibri"/>
-        </w:rPr>
-      </w:pPr>
-      <w:r>
-        <w:rPr>
-          <w:rFonts w:ascii="Calibri" w:cs="Calibri" w:eastAsia="Calibri" w:hAnsi="Calibri"/>
-          <w:rtl w:val="0"/>
-        </w:rPr>
-        <w:t xml:space="preserve">Contributed to a support organization maintaining under 2-hour average first-response times and over 96% customer satisfaction while supporting a large-scale education technology platform. </w:t>
+        <w:t xml:space="preserve">Resolved complex technical issues in collaboration with onboarding and engineering teams, and led client-facing troubleshooting sessions with district administrators and third-party vendors.</w:t>
       </w:r>
       <w:r>
         <w:rPr>

</xml_diff>